<commit_message>
Dublin Core befuellt, doi-papers geschnitten, Hosenfeld-Vorname korrigiert
- #zusaetzliche_daten/doi-papers/: 13 Einzel-PDFs nach DOI benannt
- gi-dl-datacite-dublincore-metadata.xlsx: Abstract, Keywords, Ort (Lodz), Editoren, Band P-385
- proceedings.tex: Friedhelm Hosenfeld (korrigiert)
- proceedings.pdf: neu gebaut (159 Seiten)

Co-Authored-By: Claude Sonnet 4.6 <noreply@anthropic.com>
</commit_message>
<xml_diff>
--- a/#zusätzliche_daten/LNI-Startseiten-fixed.docx
+++ b/#zusätzliche_daten/LNI-Startseiten-fixed.docx
@@ -918,26 +918,14 @@
               <w:tabs>
                 <w:tab w:val="left" w:pos="142"/>
               </w:tabs>
-              <w:rPr>
-                <w:color w:val="EE0000"/>
-              </w:rPr>
             </w:pPr>
             <w:r>
               <w:rPr>
                 <w:kern w:val="2"/>
                 <w14:ligatures w14:val="standardContextual"/>
               </w:rPr>
-              <w:t>Małgorzata Burchard-</w:t>
+              <w:t>Małgorzata Burchard-Dziubińska</w:t>
             </w:r>
-            <w:proofErr w:type="spellStart"/>
-            <w:r>
-              <w:rPr>
-                <w:kern w:val="2"/>
-                <w14:ligatures w14:val="standardContextual"/>
-              </w:rPr>
-              <w:t>Dziubińska</w:t>
-            </w:r>
-            <w:proofErr w:type="spellEnd"/>
           </w:p>
         </w:tc>
         <w:tc>
@@ -957,7 +945,6 @@
             <w:pPr>
               <w:ind w:left="-106"/>
               <w:rPr>
-                <w:color w:val="EE0000"/>
                 <w:kern w:val="2"/>
                 <w14:ligatures w14:val="standardContextual"/>
               </w:rPr>
@@ -967,39 +954,7 @@
                 <w:kern w:val="2"/>
                 <w14:ligatures w14:val="standardContextual"/>
               </w:rPr>
-              <w:t xml:space="preserve">University of </w:t>
-            </w:r>
-            <w:proofErr w:type="spellStart"/>
-            <w:r>
-              <w:rPr>
-                <w:kern w:val="2"/>
-                <w14:ligatures w14:val="standardContextual"/>
-              </w:rPr>
-              <w:t>Łódź</w:t>
-            </w:r>
-            <w:proofErr w:type="spellEnd"/>
-            <w:r>
-              <w:rPr>
-                <w:kern w:val="2"/>
-                <w14:ligatures w14:val="standardContextual"/>
-              </w:rPr>
-              <w:t xml:space="preserve">, </w:t>
-            </w:r>
-            <w:proofErr w:type="spellStart"/>
-            <w:r>
-              <w:rPr>
-                <w:kern w:val="2"/>
-                <w14:ligatures w14:val="standardContextual"/>
-              </w:rPr>
-              <w:t>Łódź</w:t>
-            </w:r>
-            <w:proofErr w:type="spellEnd"/>
-            <w:r>
-              <w:rPr>
-                <w:kern w:val="2"/>
-                <w14:ligatures w14:val="standardContextual"/>
-              </w:rPr>
-              <w:t>, Poland</w:t>
+              <w:t>University of Łódź, Łódź, Poland</w:t>
             </w:r>
           </w:p>
         </w:tc>
@@ -1024,29 +979,9 @@
     <w:p>
       <w:pPr>
         <w:pStyle w:val="Textkrper-Einzug2"/>
-        <w:rPr>
-          <w:lang w:val="de-DE"/>
-        </w:rPr>
-      </w:pPr>
-      <w:r>
-        <w:rPr>
-          <w:lang w:val="de-DE"/>
-        </w:rPr>
-        <w:t xml:space="preserve">Andreas Oberweis, KIT </w:t>
-      </w:r>
-      <w:proofErr w:type="gramStart"/>
-      <w:r>
-        <w:rPr>
-          <w:lang w:val="de-DE"/>
-        </w:rPr>
-        <w:t>Karlsruhe,  (</w:t>
-      </w:r>
-      <w:proofErr w:type="gramEnd"/>
-      <w:r>
-        <w:rPr>
-          <w:lang w:val="de-DE"/>
-        </w:rPr>
-        <w:t>Chairman, andreas.oberweis@kit.edu)</w:t>
+      </w:pPr>
+      <w:r>
+        <w:t>Andreas Oberweis, KIT Karlsruhe,  (Chairman, andreas.oberweis@kit.edu)</w:t>
       </w:r>
     </w:p>
     <w:p>
@@ -1524,14 +1459,13 @@
           <w:lang w:val="en-US"/>
         </w:rPr>
         <w:lastRenderedPageBreak/>
-        <w:t>Preface 1</w:t>
+        <w:t>Preface</w:t>
       </w:r>
     </w:p>
     <w:p>
       <w:pPr>
         <w:pStyle w:val="Zwischenberschriften"/>
         <w:rPr>
-          <w:color w:val="385623" w:themeColor="accent6" w:themeShade="80"/>
           <w:lang w:val="en-US"/>
         </w:rPr>
       </w:pPr>
@@ -1542,7 +1476,6 @@
         <w:jc w:val="both"/>
         <w:rPr>
           <w:b w:val="0"/>
-          <w:color w:val="385623" w:themeColor="accent6" w:themeShade="80"/>
           <w:sz w:val="20"/>
           <w:szCs w:val="20"/>
           <w:lang w:val="en-US"/>
@@ -1551,7 +1484,6 @@
       <w:r>
         <w:rPr>
           <w:b w:val="0"/>
-          <w:color w:val="385623" w:themeColor="accent6" w:themeShade="80"/>
           <w:sz w:val="20"/>
           <w:szCs w:val="20"/>
           <w:lang w:val="en-US"/>
@@ -1565,7 +1497,6 @@
         <w:jc w:val="both"/>
         <w:rPr>
           <w:b w:val="0"/>
-          <w:color w:val="385623" w:themeColor="accent6" w:themeShade="80"/>
           <w:sz w:val="20"/>
           <w:szCs w:val="20"/>
           <w:lang w:val="en-US"/>
@@ -1578,7 +1509,6 @@
         <w:jc w:val="both"/>
         <w:rPr>
           <w:b w:val="0"/>
-          <w:color w:val="385623" w:themeColor="accent6" w:themeShade="80"/>
           <w:sz w:val="20"/>
           <w:szCs w:val="20"/>
           <w:lang w:val="en-US"/>
@@ -1587,12 +1517,11 @@
       <w:r>
         <w:rPr>
           <w:b w:val="0"/>
-          <w:color w:val="385623" w:themeColor="accent6" w:themeShade="80"/>
           <w:sz w:val="20"/>
           <w:szCs w:val="20"/>
           <w:lang w:val="en-US"/>
         </w:rPr>
-        <w:t>Held from 9 to 11 September 2026 at the University of Łódź, Poland, the conference was organized by the technical committee of Environmental Informatics of the Gesellschaft für Informatik e.V. (GI). It took place in conjunction with the international scientific conference "Sustainable Development and Other Paradigms and Concepts in the Context of Contemporary Civilization Trends – Global and Local Dimensions" (SD26) and the Annual Meeting of the Polish Association of Environmental Economists. The University of Łódź served as the central host institution for all three events.</w:t>
+        <w:t xml:space="preserve">Held from 9 to 11 September 2026 at the University of Łódź, Poland, the conference was organized by the technical committee of Environmental Informatics of the Gesellschaft für Informatik e.V. (GI). It took place in conjunction with the international scientific conference "Sustainable Development and Other Paradigms and Concepts in the Context of Contemporary Civilization Trends – Global and Local Dimensions" (SD26) and the Annual Meeting of the Polish Association of Environmental Economists. </w:t>
       </w:r>
     </w:p>
     <w:p>
@@ -1601,7 +1530,6 @@
         <w:jc w:val="both"/>
         <w:rPr>
           <w:b w:val="0"/>
-          <w:color w:val="385623" w:themeColor="accent6" w:themeShade="80"/>
           <w:sz w:val="20"/>
           <w:szCs w:val="20"/>
           <w:lang w:val="en-US"/>
@@ -1614,7 +1542,6 @@
         <w:jc w:val="both"/>
         <w:rPr>
           <w:b w:val="0"/>
-          <w:color w:val="385623" w:themeColor="accent6" w:themeShade="80"/>
           <w:sz w:val="20"/>
           <w:szCs w:val="20"/>
           <w:lang w:val="en-US"/>
@@ -1623,7 +1550,6 @@
       <w:r>
         <w:rPr>
           <w:b w:val="0"/>
-          <w:color w:val="385623" w:themeColor="accent6" w:themeShade="80"/>
           <w:sz w:val="20"/>
           <w:szCs w:val="20"/>
           <w:lang w:val="en-US"/>
@@ -1637,7 +1563,6 @@
         <w:jc w:val="both"/>
         <w:rPr>
           <w:b w:val="0"/>
-          <w:color w:val="385623" w:themeColor="accent6" w:themeShade="80"/>
           <w:sz w:val="20"/>
           <w:szCs w:val="20"/>
           <w:lang w:val="en-US"/>
@@ -1650,7 +1575,6 @@
         <w:jc w:val="both"/>
         <w:rPr>
           <w:b w:val="0"/>
-          <w:color w:val="385623" w:themeColor="accent6" w:themeShade="80"/>
           <w:sz w:val="20"/>
           <w:szCs w:val="20"/>
           <w:lang w:val="en-US"/>
@@ -1659,49 +1583,42 @@
       <w:r>
         <w:rPr>
           <w:b w:val="0"/>
-          <w:color w:val="385623" w:themeColor="accent6" w:themeShade="80"/>
           <w:sz w:val="20"/>
           <w:szCs w:val="20"/>
           <w:lang w:val="en-US"/>
         </w:rPr>
-        <w:t>The theme of EnviroInfo 2026 – "Sustainable Development and Other Paradigms and Concepts in the Context of Contemporary Civilization Trends – Global and Local Dimensions" – opens up the conversation beyond any single framework. It situates environmental informatics within a wider debate about how societies, at both local and global scale, respond to the pressures of our time: through green computing and sustainable software, through circular economy models, through business intelligence, and through the critical examination of the paradigms that shape development itself.</w:t>
-      </w:r>
-    </w:p>
-    <w:p>
-      <w:pPr>
-        <w:pStyle w:val="Zwischenberschriften"/>
-        <w:jc w:val="both"/>
+        <w:t xml:space="preserve">The theme of EnviroInfo 2026 – "Sustainable Development and Other Paradigms and Concepts in the Context of Contemporary Civilization Trends – Global and Local Dimensions" – opens up the conversation beyond any single framework. It situates environmental informatics within a wider debate about how societies, at both local and global </w:t>
+      </w:r>
+      <w:r>
         <w:rPr>
           <w:b w:val="0"/>
-          <w:color w:val="385623" w:themeColor="accent6" w:themeShade="80"/>
           <w:sz w:val="20"/>
           <w:szCs w:val="20"/>
           <w:lang w:val="en-US"/>
         </w:rPr>
-      </w:pPr>
-    </w:p>
-    <w:p>
-      <w:pPr>
-        <w:pStyle w:val="Zwischenberschriften"/>
-        <w:jc w:val="both"/>
+        <w:t>scales</w:t>
+      </w:r>
+      <w:r>
         <w:rPr>
           <w:b w:val="0"/>
-          <w:color w:val="385623" w:themeColor="accent6" w:themeShade="80"/>
           <w:sz w:val="20"/>
           <w:szCs w:val="20"/>
           <w:lang w:val="en-US"/>
         </w:rPr>
-      </w:pPr>
-      <w:r>
+        <w:t>, respond to the pressures of our time: through green computing and sustainable software, through circular economy models, through business intelligence, and through the critical examination of the paradigms that shape development itself.</w:t>
+      </w:r>
+    </w:p>
+    <w:p>
+      <w:pPr>
+        <w:pStyle w:val="Zwischenberschriften"/>
+        <w:jc w:val="both"/>
         <w:rPr>
           <w:b w:val="0"/>
-          <w:color w:val="385623" w:themeColor="accent6" w:themeShade="80"/>
           <w:sz w:val="20"/>
           <w:szCs w:val="20"/>
           <w:lang w:val="en-US"/>
         </w:rPr>
-        <w:t>The contributions gathered here are works in progress or early-stage results – deliberately so. This volume is a space for approaches that are still taking shape, for questions not yet fully answered, and for methodological experiments that connect disciplines and cross the boundary between research and practice. Taken together, they map a field in motion: from data infrastructures and environmental management systems to green coding, sustainability indicators, and the interfaces between science, policy, and civil society.</w:t>
-      </w:r>
+      </w:pPr>
     </w:p>
     <w:p>
       <w:pPr>
@@ -1709,7 +1626,6 @@
         <w:jc w:val="both"/>
         <w:rPr>
           <w:b w:val="0"/>
-          <w:color w:val="385623" w:themeColor="accent6" w:themeShade="80"/>
           <w:sz w:val="20"/>
           <w:szCs w:val="20"/>
           <w:lang w:val="en-US"/>
@@ -1718,12 +1634,11 @@
       <w:r>
         <w:rPr>
           <w:b w:val="0"/>
-          <w:color w:val="385623" w:themeColor="accent6" w:themeShade="80"/>
           <w:sz w:val="20"/>
           <w:szCs w:val="20"/>
           <w:lang w:val="en-US"/>
         </w:rPr>
-        <w:t>We thank all authors for sharing their work at this stage of development. We equally thank the members of the program and organization committee for their thorough and careful reviews. Our appreciation goes to the University of Łódź as host, to the organizers of SD26 and the Polish Association of Environmental Economists as co-organizers, and to the Gesellschaft für Informatik e.V.  We also thank the European universities of the UNIC alliance (European University of Cities in Post-industrial Transition – UNIC 2.0), in particular within Thematic Line 2 (TL2: Sustainability &amp; green cities) and related thematic lines on Urban resilience &amp; smart cities (TL3), Health and wellbeing (TL6), and Justice, security and institutions (TL4), for their cooperation in making this conference possible. Finally, we thank our sponsors, whose support was essential to making this conference happen.</w:t>
+        <w:t>The contributions gathered here are works in progress or early-stage results – deliberately so. This volume is a space for approaches that are still taking shape, for questions not yet fully answered, and for methodological experiments that connect disciplines and cross the boundary between research and practice. Taken together, they map a field in motion: from data infrastructures and environmental management systems to green coding, sustainability indicators, and the interfaces between science, policy, and civil society.</w:t>
       </w:r>
     </w:p>
     <w:p>
@@ -1732,145 +1647,83 @@
         <w:jc w:val="both"/>
         <w:rPr>
           <w:b w:val="0"/>
-          <w:color w:val="385623" w:themeColor="accent6" w:themeShade="80"/>
           <w:sz w:val="20"/>
           <w:szCs w:val="20"/>
           <w:lang w:val="en-US"/>
         </w:rPr>
       </w:pPr>
-      <w:proofErr w:type="spellStart"/>
-      <w:r>
+    </w:p>
+    <w:p>
+      <w:pPr>
+        <w:pStyle w:val="Zwischenberschriften"/>
+        <w:jc w:val="both"/>
         <w:rPr>
           <w:b w:val="0"/>
-          <w:color w:val="385623" w:themeColor="accent6" w:themeShade="80"/>
           <w:sz w:val="20"/>
           <w:szCs w:val="20"/>
           <w:lang w:val="en-US"/>
         </w:rPr>
-        <w:t>Łódź</w:t>
-      </w:r>
-      <w:proofErr w:type="spellEnd"/>
+      </w:pPr>
       <w:r>
         <w:rPr>
           <w:b w:val="0"/>
-          <w:color w:val="385623" w:themeColor="accent6" w:themeShade="80"/>
           <w:sz w:val="20"/>
           <w:szCs w:val="20"/>
           <w:lang w:val="en-US"/>
         </w:rPr>
-        <w:t>, September 2026</w:t>
-      </w:r>
-    </w:p>
-    <w:p>
-      <w:pPr>
-        <w:pStyle w:val="Zwischenberschriften"/>
+        <w:t xml:space="preserve">We thank all authors for sharing their work at this stage of development. We equally thank the members of the program and organization committee for their thorough and careful reviews. </w:t>
+      </w:r>
+      <w:r>
         <w:rPr>
           <w:b w:val="0"/>
-          <w:color w:val="385623" w:themeColor="accent6" w:themeShade="80"/>
           <w:sz w:val="20"/>
           <w:szCs w:val="20"/>
           <w:lang w:val="en-US"/>
         </w:rPr>
-      </w:pPr>
+        <w:t xml:space="preserve">We thank the University of Łódź as host, the organizers of SD26 and the Polish Association of Environmental Economists as co-organizers, and </w:t>
+      </w:r>
       <w:r>
         <w:rPr>
           <w:b w:val="0"/>
-          <w:color w:val="385623" w:themeColor="accent6" w:themeShade="80"/>
           <w:sz w:val="20"/>
           <w:szCs w:val="20"/>
           <w:lang w:val="en-US"/>
         </w:rPr>
-        <w:t>On behalf of the Organizing Committee</w:t>
+        <w:t xml:space="preserve">the Gesellschaft für Informatik e.V. We also thank the European universities of the UNIC alliance (European University of Cities in Post-industrial Transition – UNIC 2.0), for their cooperation in making this conference possible. </w:t>
       </w:r>
     </w:p>
     <w:p>
       <w:pPr>
         <w:pStyle w:val="Zwischenberschriften"/>
+        <w:jc w:val="both"/>
         <w:rPr>
           <w:b w:val="0"/>
-          <w:color w:val="385623" w:themeColor="accent6" w:themeShade="80"/>
-          <w:sz w:val="20"/>
-          <w:szCs w:val="20"/>
-        </w:rPr>
-      </w:pPr>
-      <w:r>
-        <w:rPr>
-          <w:b w:val="0"/>
-          <w:color w:val="385623" w:themeColor="accent6" w:themeShade="80"/>
-          <w:sz w:val="20"/>
-          <w:szCs w:val="20"/>
-        </w:rPr>
-        <w:lastRenderedPageBreak/>
-        <w:t>Volker Wohlgemuth, Stefan Naumann, Grit Behrens, Malgorzata Burchard-Dziubińska</w:t>
-      </w:r>
-    </w:p>
-    <w:p>
-      <w:pPr>
-        <w:rPr>
-          <w:color w:val="385623" w:themeColor="accent6" w:themeShade="80"/>
-          <w:lang w:val="de-DE"/>
-        </w:rPr>
-      </w:pPr>
-      <w:r>
-        <w:rPr>
-          <w:b/>
-          <w:color w:val="385623" w:themeColor="accent6" w:themeShade="80"/>
-          <w:lang w:val="de-DE"/>
-        </w:rPr>
-        <w:br w:type="page"/>
-      </w:r>
-    </w:p>
-    <w:p>
-      <w:pPr>
-        <w:pStyle w:val="Zwischenberschriften"/>
-        <w:rPr>
-          <w:color w:val="385623" w:themeColor="accent6" w:themeShade="80"/>
-          <w:lang w:val="en-US"/>
-        </w:rPr>
-      </w:pPr>
-      <w:r>
-        <w:rPr>
-          <w:color w:val="385623" w:themeColor="accent6" w:themeShade="80"/>
-          <w:lang w:val="en-US"/>
-        </w:rPr>
-        <w:lastRenderedPageBreak/>
-        <w:t>Preface 2</w:t>
-      </w:r>
-    </w:p>
-    <w:p>
-      <w:pPr>
-        <w:pStyle w:val="Zwischenberschriften"/>
-        <w:rPr>
-          <w:b w:val="0"/>
-          <w:color w:val="385623" w:themeColor="accent6" w:themeShade="80"/>
           <w:sz w:val="20"/>
           <w:szCs w:val="20"/>
           <w:lang w:val="en-US"/>
         </w:rPr>
       </w:pPr>
-    </w:p>
-    <w:p>
-      <w:pPr>
-        <w:pStyle w:val="Zwischenberschriften"/>
-        <w:jc w:val="both"/>
+      <w:r>
         <w:rPr>
           <w:b w:val="0"/>
-          <w:color w:val="385623" w:themeColor="accent6" w:themeShade="80"/>
           <w:sz w:val="20"/>
           <w:szCs w:val="20"/>
           <w:lang w:val="en-US"/>
         </w:rPr>
-      </w:pPr>
-      <w:r>
+        <w:t>Finally, we thank our sponsors, whose support was essential to making this conference happen.</w:t>
+      </w:r>
+    </w:p>
+    <w:p>
+      <w:pPr>
+        <w:pStyle w:val="Zwischenberschriften"/>
+        <w:jc w:val="both"/>
         <w:rPr>
           <w:b w:val="0"/>
-          <w:color w:val="385623" w:themeColor="accent6" w:themeShade="80"/>
           <w:sz w:val="20"/>
           <w:szCs w:val="20"/>
           <w:lang w:val="en-US"/>
         </w:rPr>
-        <w:t>This book contains the short and work-in-progress contributions of the 40th International and Interdisciplinary Conference on Environmental Informatics – EnviroInfo 2026.</w:t>
-      </w:r>
+      </w:pPr>
     </w:p>
     <w:p>
       <w:pPr>
@@ -1878,221 +1731,65 @@
         <w:jc w:val="both"/>
         <w:rPr>
           <w:b w:val="0"/>
-          <w:color w:val="385623" w:themeColor="accent6" w:themeShade="80"/>
           <w:sz w:val="20"/>
           <w:szCs w:val="20"/>
           <w:lang w:val="en-US"/>
         </w:rPr>
       </w:pPr>
-    </w:p>
-    <w:p>
-      <w:pPr>
-        <w:pStyle w:val="Zwischenberschriften"/>
-        <w:jc w:val="both"/>
+      <w:r>
         <w:rPr>
           <w:b w:val="0"/>
-          <w:color w:val="385623" w:themeColor="accent6" w:themeShade="80"/>
           <w:sz w:val="20"/>
           <w:szCs w:val="20"/>
           <w:lang w:val="en-US"/>
         </w:rPr>
-      </w:pPr>
-      <w:r>
+        <w:t>Łódź, September 2026</w:t>
+      </w:r>
+    </w:p>
+    <w:p>
+      <w:pPr>
+        <w:pStyle w:val="Zwischenberschriften"/>
         <w:rPr>
           <w:b w:val="0"/>
-          <w:color w:val="385623" w:themeColor="accent6" w:themeShade="80"/>
           <w:sz w:val="20"/>
           <w:szCs w:val="20"/>
           <w:lang w:val="en-US"/>
         </w:rPr>
-        <w:t>The conference took place from 9 to 11 September 2026 at the University of Łódź, Poland, organized by the Technical Committee on Environmental Informatics of the Gesellschaft für Informatik e.V. (GI), together with the University of Łódź and the Polish Association of Environmental Economists. EnviroInfo 2026 ran alongside the international scientific conference "Sustainable Development and Other Paradigms and Concepts in the Context of Contemporary Civilization Trends – Global and Local Dimensions", put together by the Department of Development Economics and the Department of City and Regional Management of the University of Łódź and the Polish Association of Environmental and Natural Resource Economists. The University of Łódź provided the institutional home for what marks a milestone edition of the series.</w:t>
-      </w:r>
-    </w:p>
-    <w:p>
-      <w:pPr>
-        <w:pStyle w:val="Zwischenberschriften"/>
-        <w:jc w:val="both"/>
+      </w:pPr>
+      <w:r>
         <w:rPr>
           <w:b w:val="0"/>
-          <w:color w:val="385623" w:themeColor="accent6" w:themeShade="80"/>
           <w:sz w:val="20"/>
           <w:szCs w:val="20"/>
           <w:lang w:val="en-US"/>
         </w:rPr>
-      </w:pPr>
+        <w:t>On behalf of the Organizing Committee</w:t>
+      </w:r>
     </w:p>
     <w:p>
       <w:pPr>
         <w:pStyle w:val="Zwischenberschriften"/>
-        <w:jc w:val="both"/>
+      </w:pPr>
+      <w:r>
         <w:rPr>
           <w:b w:val="0"/>
-          <w:color w:val="385623" w:themeColor="accent6" w:themeShade="80"/>
           <w:sz w:val="20"/>
           <w:szCs w:val="20"/>
+        </w:rPr>
+        <w:t>Volker Wohlgemuth, Stefan Naumann, Grit Behrens, Malgorzata Burchard-Dziubińska</w:t>
+      </w:r>
+      <w:r>
+        <w:br w:type="page"/>
+      </w:r>
+    </w:p>
+    <w:p>
+      <w:pPr>
+        <w:pStyle w:val="Zwischenberschriften"/>
+        <w:jc w:val="both"/>
+        <w:rPr>
           <w:lang w:val="en-US"/>
         </w:rPr>
       </w:pPr>
-      <w:r>
-        <w:rPr>
-          <w:b w:val="0"/>
-          <w:color w:val="385623" w:themeColor="accent6" w:themeShade="80"/>
-          <w:sz w:val="20"/>
-          <w:szCs w:val="20"/>
-          <w:lang w:val="en-US"/>
-        </w:rPr>
-        <w:t>For forty years, EnviroInfo has drawn together researchers and practitioners from applied computer science and sustainability who share a common goal: to channel advances in information and communication technologies into real progress toward a sustainable society. The 40th edition carries that tradition forward under the theme "Sustainable Development and Other Paradigms and Concepts in the Context of Contemporary Civilization Trends – Global and Local Dimensions" – a framing that treats sustainable development not as a settled answer but as a live paradigm, still being tested against other concepts and pressures at every scale from the local to the global.</w:t>
-      </w:r>
-    </w:p>
-    <w:p>
-      <w:pPr>
-        <w:pStyle w:val="Zwischenberschriften"/>
-        <w:jc w:val="both"/>
-        <w:rPr>
-          <w:b w:val="0"/>
-          <w:color w:val="385623" w:themeColor="accent6" w:themeShade="80"/>
-          <w:sz w:val="20"/>
-          <w:szCs w:val="20"/>
-          <w:lang w:val="en-US"/>
-        </w:rPr>
-      </w:pPr>
-    </w:p>
-    <w:p>
-      <w:pPr>
-        <w:pStyle w:val="Zwischenberschriften"/>
-        <w:jc w:val="both"/>
-        <w:rPr>
-          <w:b w:val="0"/>
-          <w:color w:val="385623" w:themeColor="accent6" w:themeShade="80"/>
-          <w:sz w:val="20"/>
-          <w:szCs w:val="20"/>
-          <w:lang w:val="en-US"/>
-        </w:rPr>
-      </w:pPr>
-      <w:r>
-        <w:rPr>
-          <w:b w:val="0"/>
-          <w:color w:val="385623" w:themeColor="accent6" w:themeShade="80"/>
-          <w:sz w:val="20"/>
-          <w:szCs w:val="20"/>
-          <w:lang w:val="en-US"/>
-        </w:rPr>
-        <w:t>The contributions gathered here are works in progress or early-stage results. This volume makes space for approaches still taking shape, for methods being tested across disciplinary boundaries, and for research that reaches toward policy and practice rather than staying within academic walls. The range is wide: green computing and sustainable software engineering, circular economy models, business intelligence, data infrastructure, and applications that draw science, governance, and civil society into conversation.</w:t>
-      </w:r>
-    </w:p>
-    <w:p>
-      <w:pPr>
-        <w:pStyle w:val="Zwischenberschriften"/>
-        <w:jc w:val="both"/>
-        <w:rPr>
-          <w:b w:val="0"/>
-          <w:color w:val="385623" w:themeColor="accent6" w:themeShade="80"/>
-          <w:sz w:val="20"/>
-          <w:szCs w:val="20"/>
-          <w:lang w:val="en-US"/>
-        </w:rPr>
-      </w:pPr>
-    </w:p>
-    <w:p>
-      <w:pPr>
-        <w:pStyle w:val="Zwischenberschriften"/>
-        <w:jc w:val="both"/>
-        <w:rPr>
-          <w:b w:val="0"/>
-          <w:color w:val="385623" w:themeColor="accent6" w:themeShade="80"/>
-          <w:sz w:val="20"/>
-          <w:szCs w:val="20"/>
-          <w:lang w:val="en-US"/>
-        </w:rPr>
-      </w:pPr>
-      <w:r>
-        <w:rPr>
-          <w:b w:val="0"/>
-          <w:color w:val="385623" w:themeColor="accent6" w:themeShade="80"/>
-          <w:sz w:val="20"/>
-          <w:szCs w:val="20"/>
-          <w:lang w:val="en-US"/>
-        </w:rPr>
-        <w:t>Thanks are owed first to the authors, who shared their work at a formative stage. The members of the Program and Organization Committees deserve equal recognition for the care they brought to the review process. We are grateful to the University of Łódź for hosting the event, to the Polish Association of Environmental Economists for the joint organization, and to the Gesellschaft für Informatik e.V. for its steady support of EnviroInfo across four decades.  We also thank the European universities of the UNIC alliance (European University of Cities in Post-industrial Transition – UNIC 2.0), in particular within Thematic Line 2 (TL2: Sustainability &amp; green cities) and related thematic lines on Urban resilience &amp; smart cities (TL3), Health and wellbeing (TL6), and Justice, security and institutions (TL4), for their cooperation in making this conference possible. Finally, we thank our sponsors, whose support was essential to making this conference happen.</w:t>
-      </w:r>
-    </w:p>
-    <w:p>
-      <w:pPr>
-        <w:pStyle w:val="Zwischenberschriften"/>
-        <w:jc w:val="both"/>
-        <w:rPr>
-          <w:b w:val="0"/>
-          <w:color w:val="385623" w:themeColor="accent6" w:themeShade="80"/>
-          <w:sz w:val="20"/>
-          <w:szCs w:val="20"/>
-          <w:lang w:val="en-US"/>
-        </w:rPr>
-      </w:pPr>
-    </w:p>
-    <w:p>
-      <w:pPr>
-        <w:pStyle w:val="Zwischenberschriften"/>
-        <w:jc w:val="both"/>
-        <w:rPr>
-          <w:b w:val="0"/>
-          <w:color w:val="385623" w:themeColor="accent6" w:themeShade="80"/>
-          <w:sz w:val="20"/>
-          <w:szCs w:val="20"/>
-          <w:lang w:val="en-US"/>
-        </w:rPr>
-      </w:pPr>
-      <w:r>
-        <w:rPr>
-          <w:b w:val="0"/>
-          <w:color w:val="385623" w:themeColor="accent6" w:themeShade="80"/>
-          <w:sz w:val="20"/>
-          <w:szCs w:val="20"/>
-          <w:lang w:val="en-US"/>
-        </w:rPr>
-        <w:lastRenderedPageBreak/>
-        <w:t>Łódź, September 2026</w:t>
-      </w:r>
-      <w:r>
-        <w:rPr>
-          <w:b w:val="0"/>
-          <w:color w:val="385623" w:themeColor="accent6" w:themeShade="80"/>
-          <w:sz w:val="20"/>
-          <w:szCs w:val="20"/>
-          <w:lang w:val="en-US"/>
-        </w:rPr>
-        <w:br/>
-        <w:t>On behalf of the Organizing Committee</w:t>
-      </w:r>
-      <w:r>
-        <w:rPr>
-          <w:b w:val="0"/>
-          <w:color w:val="385623" w:themeColor="accent6" w:themeShade="80"/>
-          <w:sz w:val="20"/>
-          <w:szCs w:val="20"/>
-          <w:lang w:val="en-US"/>
-        </w:rPr>
-        <w:br/>
-        <w:t>Volker Wohlgemuth, Conference President</w:t>
-      </w:r>
-    </w:p>
-    <w:p>
-      <w:pPr>
-        <w:pStyle w:val="Zwischenberschriften"/>
-        <w:jc w:val="both"/>
-        <w:rPr>
-          <w:lang w:val="en-US"/>
-        </w:rPr>
-      </w:pPr>
-      <w:r>
-        <w:rPr>
-          <w:b w:val="0"/>
-          <w:color w:val="EE0000"/>
-          <w:sz w:val="20"/>
-          <w:szCs w:val="20"/>
-          <w:lang w:val="en-US"/>
-        </w:rPr>
-        <w:br w:type="page"/>
-      </w:r>
       <w:r>
         <w:rPr>
           <w:lang w:val="en-US"/>
@@ -2125,20 +1822,35 @@
         </w:tabs>
       </w:pPr>
     </w:p>
+    <w:p>
+      <w:pPr>
+        <w:tabs>
+          <w:tab w:val="left" w:pos="142"/>
+        </w:tabs>
+      </w:pPr>
+    </w:p>
     <w:tbl>
       <w:tblPr>
-        <w:tblW w:w="7479" w:type="dxa"/>
-        <w:tblLayout w:type="fixed"/>
-        <w:tblLook w:val="01E0" w:firstRow="1" w:lastRow="1" w:firstColumn="1" w:lastColumn="1" w:noHBand="0" w:noVBand="0"/>
+        <w:tblStyle w:val="Tabellenraster"/>
+        <w:tblW w:w="0" w:type="auto"/>
+        <w:tblBorders>
+          <w:top w:val="none" w:sz="0" w:space="0" w:color="auto"/>
+          <w:left w:val="none" w:sz="0" w:space="0" w:color="auto"/>
+          <w:bottom w:val="none" w:sz="0" w:space="0" w:color="auto"/>
+          <w:right w:val="none" w:sz="0" w:space="0" w:color="auto"/>
+          <w:insideH w:val="none" w:sz="0" w:space="0" w:color="auto"/>
+          <w:insideV w:val="none" w:sz="0" w:space="0" w:color="auto"/>
+        </w:tblBorders>
+        <w:tblLook w:val="04A0" w:firstRow="1" w:lastRow="0" w:firstColumn="1" w:lastColumn="0" w:noHBand="0" w:noVBand="1"/>
       </w:tblPr>
       <w:tblGrid>
-        <w:gridCol w:w="4395"/>
-        <w:gridCol w:w="3084"/>
+        <w:gridCol w:w="3567"/>
+        <w:gridCol w:w="3567"/>
       </w:tblGrid>
       <w:tr>
         <w:tc>
           <w:tcPr>
-            <w:tcW w:w="4395" w:type="dxa"/>
+            <w:tcW w:w="3567" w:type="dxa"/>
           </w:tcPr>
           <w:p>
             <w:pPr>
@@ -2153,7 +1865,7 @@
         </w:tc>
         <w:tc>
           <w:tcPr>
-            <w:tcW w:w="3084" w:type="dxa"/>
+            <w:tcW w:w="3567" w:type="dxa"/>
           </w:tcPr>
           <w:p>
             <w:pPr>
@@ -2161,9 +1873,6 @@
                 <w:tab w:val="left" w:pos="142"/>
               </w:tabs>
               <w:jc w:val="right"/>
-              <w:rPr>
-                <w:lang w:val="de-AT"/>
-              </w:rPr>
             </w:pPr>
             <w:r>
               <w:rPr>
@@ -2171,9 +1880,9 @@
                 <w:lang w:val="de-AT"/>
               </w:rPr>
               <w:drawing>
-                <wp:inline distT="0" distB="0" distL="0" distR="0" wp14:anchorId="63B6A7C2" wp14:editId="65438413">
-                  <wp:extent cx="862148" cy="246328"/>
-                  <wp:effectExtent l="0" t="0" r="0" b="1905"/>
+                <wp:inline distT="0" distB="0" distL="0" distR="0" wp14:anchorId="7980F626" wp14:editId="5D9C1217">
+                  <wp:extent cx="1140834" cy="325953"/>
+                  <wp:effectExtent l="0" t="0" r="2540" b="0"/>
                   <wp:docPr id="1" name="Grafik 1"/>
                   <wp:cNvGraphicFramePr>
                     <a:graphicFrameLocks xmlns:a="http://schemas.openxmlformats.org/drawingml/2006/main" noChangeAspect="1"/>
@@ -2202,7 +1911,7 @@
                         <pic:spPr bwMode="auto">
                           <a:xfrm>
                             <a:off x="0" y="0"/>
-                            <a:ext cx="889888" cy="254254"/>
+                            <a:ext cx="1198416" cy="342405"/>
                           </a:xfrm>
                           <a:prstGeom prst="rect">
                             <a:avLst/>
@@ -2221,7 +1930,7 @@
       <w:tr>
         <w:tc>
           <w:tcPr>
-            <w:tcW w:w="4395" w:type="dxa"/>
+            <w:tcW w:w="3567" w:type="dxa"/>
           </w:tcPr>
           <w:p>
             <w:pPr>
@@ -2233,10 +1942,23 @@
               </w:rPr>
             </w:pPr>
           </w:p>
+          <w:p>
+            <w:pPr>
+              <w:tabs>
+                <w:tab w:val="left" w:pos="142"/>
+              </w:tabs>
+            </w:pPr>
+            <w:r>
+              <w:rPr>
+                <w:lang w:val="de-AT"/>
+              </w:rPr>
+              <w:t>German Informatics Society</w:t>
+            </w:r>
+          </w:p>
         </w:tc>
         <w:tc>
           <w:tcPr>
-            <w:tcW w:w="3084" w:type="dxa"/>
+            <w:tcW w:w="3567" w:type="dxa"/>
           </w:tcPr>
           <w:p>
             <w:pPr>
@@ -2244,58 +1966,16 @@
                 <w:tab w:val="left" w:pos="142"/>
               </w:tabs>
               <w:jc w:val="right"/>
-              <w:rPr>
-                <w:lang w:val="de-AT"/>
-              </w:rPr>
-            </w:pPr>
-          </w:p>
-        </w:tc>
-      </w:tr>
-      <w:tr>
-        <w:tc>
-          <w:tcPr>
-            <w:tcW w:w="4395" w:type="dxa"/>
-          </w:tcPr>
-          <w:p>
-            <w:pPr>
-              <w:tabs>
-                <w:tab w:val="left" w:pos="142"/>
-              </w:tabs>
-              <w:rPr>
-                <w:lang w:val="de-AT"/>
-              </w:rPr>
             </w:pPr>
             <w:r>
               <w:rPr>
-                <w:lang w:val="de-AT"/>
-              </w:rPr>
-              <w:t>German Informatics Society</w:t>
-            </w:r>
-          </w:p>
-        </w:tc>
-        <w:tc>
-          <w:tcPr>
-            <w:tcW w:w="3084" w:type="dxa"/>
-          </w:tcPr>
-          <w:p>
-            <w:pPr>
-              <w:tabs>
-                <w:tab w:val="left" w:pos="142"/>
-              </w:tabs>
-              <w:jc w:val="right"/>
-              <w:rPr>
-                <w:lang w:val="de-AT"/>
-              </w:rPr>
-            </w:pPr>
-            <w:r>
-              <w:rPr>
                 <w:noProof/>
                 <w:lang w:val="de-DE"/>
               </w:rPr>
               <w:drawing>
-                <wp:inline distT="0" distB="0" distL="0" distR="0" wp14:anchorId="6D67357C" wp14:editId="72ABA511">
-                  <wp:extent cx="935930" cy="318386"/>
-                  <wp:effectExtent l="0" t="0" r="0" b="5715"/>
+                <wp:inline distT="0" distB="0" distL="0" distR="0" wp14:anchorId="77D23BC1" wp14:editId="574B5A1E">
+                  <wp:extent cx="1297246" cy="441298"/>
+                  <wp:effectExtent l="0" t="0" r="0" b="0"/>
                   <wp:docPr id="5" name="Bild 3"/>
                   <wp:cNvGraphicFramePr>
                     <a:graphicFrameLocks xmlns:a="http://schemas.openxmlformats.org/drawingml/2006/main" noChangeAspect="1"/>
@@ -2324,7 +2004,7 @@
                         <pic:spPr bwMode="auto">
                           <a:xfrm>
                             <a:off x="0" y="0"/>
-                            <a:ext cx="948380" cy="322621"/>
+                            <a:ext cx="1327728" cy="451667"/>
                           </a:xfrm>
                           <a:prstGeom prst="rect">
                             <a:avLst/>
@@ -2343,84 +2023,12 @@
           </w:p>
         </w:tc>
       </w:tr>
-      <w:tr>
-        <w:tc>
-          <w:tcPr>
-            <w:tcW w:w="4395" w:type="dxa"/>
-          </w:tcPr>
-          <w:p>
-            <w:pPr>
-              <w:tabs>
-                <w:tab w:val="left" w:pos="142"/>
-              </w:tabs>
-              <w:rPr>
-                <w:lang w:val="de-AT"/>
-              </w:rPr>
-            </w:pPr>
-          </w:p>
-        </w:tc>
-        <w:tc>
-          <w:tcPr>
-            <w:tcW w:w="3084" w:type="dxa"/>
-          </w:tcPr>
-          <w:p>
-            <w:pPr>
-              <w:tabs>
-                <w:tab w:val="left" w:pos="142"/>
-              </w:tabs>
-              <w:jc w:val="right"/>
-              <w:rPr>
-                <w:lang w:val="de-AT"/>
-              </w:rPr>
-            </w:pPr>
-          </w:p>
-        </w:tc>
-      </w:tr>
-      <w:tr>
-        <w:trPr>
-          <w:trHeight w:val="60"/>
-        </w:trPr>
-        <w:tc>
-          <w:tcPr>
-            <w:tcW w:w="4395" w:type="dxa"/>
-          </w:tcPr>
-          <w:p>
-            <w:pPr>
-              <w:tabs>
-                <w:tab w:val="left" w:pos="142"/>
-              </w:tabs>
-              <w:rPr>
-                <w:lang w:val="de-AT"/>
-              </w:rPr>
-            </w:pPr>
-          </w:p>
-        </w:tc>
-        <w:tc>
-          <w:tcPr>
-            <w:tcW w:w="3084" w:type="dxa"/>
-          </w:tcPr>
-          <w:p>
-            <w:pPr>
-              <w:tabs>
-                <w:tab w:val="left" w:pos="142"/>
-              </w:tabs>
-              <w:jc w:val="right"/>
-              <w:rPr>
-                <w:lang w:val="de-AT"/>
-              </w:rPr>
-            </w:pPr>
-          </w:p>
-        </w:tc>
-      </w:tr>
     </w:tbl>
     <w:p>
       <w:pPr>
         <w:tabs>
           <w:tab w:val="left" w:pos="142"/>
         </w:tabs>
-        <w:rPr>
-          <w:lang w:val="de-AT"/>
-        </w:rPr>
       </w:pPr>
     </w:p>
     <w:p>
@@ -2661,6 +2269,9 @@
         </w:tc>
       </w:tr>
       <w:tr>
+        <w:trPr>
+          <w:trHeight w:val="60"/>
+        </w:trPr>
         <w:tc>
           <w:tcPr>
             <w:tcW w:w="2268" w:type="dxa"/>
@@ -2858,15 +2469,7 @@
         <w:jc w:val="both"/>
       </w:pPr>
       <w:r>
-        <w:t xml:space="preserve">Benjamin Wagner </w:t>
-      </w:r>
-      <w:proofErr w:type="gramStart"/>
-      <w:r>
-        <w:t>vom</w:t>
-      </w:r>
-      <w:proofErr w:type="gramEnd"/>
-      <w:r>
-        <w:t xml:space="preserve"> Berg, University of Applied Sciences Bremerhaven, Germany</w:t>
+        <w:t>Benjamin Wagner vom Berg, University of Applied Sciences Bremerhaven, Germany</w:t>
       </w:r>
     </w:p>
     <w:p>
@@ -3078,11 +2681,12 @@
         <w:jc w:val="both"/>
       </w:pPr>
       <w:r>
-        <w:t>Thomas Rose, RWTH Aachen University - Media Informatics / Media Processes, Germany</w:t>
-      </w:r>
-    </w:p>
-    <w:p>
-      <w:pPr>
+        <w:t>Thomas Rose, RWTH Aachen University - Media Informatics / Processes, Germany</w:t>
+      </w:r>
+    </w:p>
+    <w:p>
+      <w:pPr>
+        <w:jc w:val="both"/>
         <w:rPr>
           <w:b/>
           <w:sz w:val="28"/>
@@ -3107,6 +2711,13 @@
         <w:lastRenderedPageBreak/>
         <w:t>Organizing Committee</w:t>
       </w:r>
+    </w:p>
+    <w:p>
+      <w:pPr>
+        <w:tabs>
+          <w:tab w:val="left" w:pos="142"/>
+        </w:tabs>
+      </w:pPr>
     </w:p>
     <w:p>
       <w:pPr>
@@ -3176,7 +2787,7 @@
               <w:rPr>
                 <w:szCs w:val="24"/>
               </w:rPr>
-              <w:t>HTW Berlin – University of Applied Sciences., Berlin, Germany</w:t>
+              <w:t>HTW Berlin – University of Applied Sciences, Berlin, Germany</w:t>
             </w:r>
           </w:p>
         </w:tc>
@@ -3380,6 +2991,9 @@
           <w:tab w:val="left" w:pos="2694"/>
         </w:tabs>
       </w:pPr>
+      <w:r>
+        <w:t xml:space="preserve"> </w:t>
+      </w:r>
     </w:p>
     <w:sectPr>
       <w:headerReference w:type="first" r:id="rId13"/>
@@ -3457,21 +3071,7 @@
       <w:rPr>
         <w:lang w:val="de-DE"/>
       </w:rPr>
-      <w:t xml:space="preserve">(Hrsg.): </w:t>
-    </w:r>
-    <w:proofErr w:type="spellStart"/>
-    <w:r>
-      <w:rPr>
-        <w:lang w:val="de-DE"/>
-      </w:rPr>
-      <w:t>EnviroInfo</w:t>
-    </w:r>
-    <w:proofErr w:type="spellEnd"/>
-    <w:r>
-      <w:rPr>
-        <w:lang w:val="de-DE"/>
-      </w:rPr>
-      <w:t xml:space="preserve"> 20</w:t>
+      <w:t>(Hrsg.): EnviroInfo 20</w:t>
     </w:r>
     <w:r>
       <w:rPr>
@@ -3503,33 +3103,11 @@
         <w:lang w:val="de-DE"/>
       </w:rPr>
     </w:pPr>
-    <w:proofErr w:type="spellStart"/>
     <w:r>
       <w:rPr>
         <w:lang w:val="de-DE"/>
       </w:rPr>
-      <w:t>Lecture</w:t>
-    </w:r>
-    <w:proofErr w:type="spellEnd"/>
-    <w:r>
-      <w:rPr>
-        <w:lang w:val="de-DE"/>
-      </w:rPr>
-      <w:t xml:space="preserve"> Notes in </w:t>
-    </w:r>
-    <w:proofErr w:type="spellStart"/>
-    <w:r>
-      <w:rPr>
-        <w:lang w:val="de-DE"/>
-      </w:rPr>
-      <w:t>Informatics</w:t>
-    </w:r>
-    <w:proofErr w:type="spellEnd"/>
-    <w:r>
-      <w:rPr>
-        <w:lang w:val="de-DE"/>
-      </w:rPr>
-      <w:t xml:space="preserve"> (LNI), Gesellschaft für Informatik, Bonn 202</w:t>
+      <w:t>Lecture Notes in Informatics (LNI), Gesellschaft für Informatik, Bonn 202</w:t>
     </w:r>
     <w:r>
       <w:rPr>
@@ -3600,7 +3178,7 @@
         <v:path o:extrusionok="f" gradientshapeok="t" o:connecttype="rect"/>
         <o:lock v:ext="edit" aspectratio="t"/>
       </v:shapetype>
-      <v:shape id="_x0000_i1025" type="#_x0000_t75" style="width:26.9pt;height:26.9pt;visibility:visible;mso-wrap-style:square" o:bullet="t">
+      <v:shape id="_x0000_i1025" type="#_x0000_t75" style="width:27.05pt;height:27.05pt;visibility:visible;mso-wrap-style:square" o:bullet="t">
         <v:imagedata r:id="rId1" o:title=""/>
       </v:shape>
     </w:pict>

</xml_diff>